<commit_message>
03.3: map eight patterns to the manuscript's four; correct T010/T011 evidence status
</commit_message>
<xml_diff>
--- a/materials/03_rg_taxonomy/asb_framework_03_3_structural_patterns.docx
+++ b/materials/03_rg_taxonomy/asb_framework_03_3_structural_patterns.docx
@@ -51,7 +51,7 @@
           <w:sz w:val="24"/>
           <w:szCs w:val="24"/>
         </w:rPr>
-        <w:t>Eight structural patterns were identified in the Stage 1 evidence base. Each pattern is presented with a key claim, the supporting evidence (drawing on quantitative, qualitative, and policy records as available), and the framework design decision it motivated. The patterns are partitioned into two groups by the analytic basis on which they were detected. Group A patterns are observable across the full evidence base independent of cross-domain comparison; they describe asymmetries within or between tool codes that single-tool analyses can surface. Group B patterns emerge only through systematic cross-domain mapping enabled by the standardised extraction structure; they describe relationships across populations, delivery parameters, and finding directions that are visible only when records can be aggregated across categories.</w:t>
+        <w:t>Eight structural patterns were identified in the Stage 1 evidence base. Each pattern is presented with a key claim, the supporting evidence (drawing on quantitative, qualitative, and policy records as available), and the framework design decision it motivated. The patterns are partitioned into two groups by the analytic basis on which they were detected. Group A patterns are observable across the full evidence base independent of cross-domain comparison; they describe asymmetries within or between tool codes that single-tool analyses can surface. Group B patterns emerge only through systematic cross-domain mapping enabled by the standardised extraction structure; they describe relationships across populations, delivery parameters, and finding directions that are visible only when records can be aggregated across categories. The main manuscript summarises these eight patterns as four: translation gaps (Patterns 1 to 3), population misalignment (Pattern 4), reporting limitations (Pattern 5), and design contraindications (Patterns 6 and 8); Pattern 7 (self-regulatory strategies as design resources) is reported here only.</w:t>
       </w:r>
     </w:p>
     <w:p>
@@ -637,7 +637,7 @@
           <w:sz w:val="24"/>
           <w:szCs w:val="24"/>
         </w:rPr>
-        <w:t>The Framework operationalises tier targeting through the Target Population field on each tool rather than through duplicate per-tier entries. Universal-target tools dominate the Framework, reflecting the framework principle that most framework tools should be available across all tiers with delivery defaults shifting by risk. Tier-specific entries cluster at the high-risk end (THER cluster T123–T136; CONTACT-PROACTIVE T097–T101) where the literature concentrates. The moderate-risk uptake gap shaped a distinct group of extrapolated entries: T010 opt-out registration prompt, T011 algorithmically-suggested deposit limit, T202 risk-adaptive dynamic default limits, T204 risk-score-linked ceilings. These translate the prevention-paradox finding into default-on or risk-triggered architectures rather than relying on voluntary uptake. The autonomy-supportive vs action-oriented framing distinction sits in tool delivery specifications rather than as separate entries.</w:t>
+        <w:t>The Framework operationalises tier targeting through the Target Population field on each tool rather than through duplicate per-tier entries. Universal-target tools dominate the Framework, reflecting the framework principle that most framework tools should be available across all tiers with delivery defaults shifting by risk. Tier-specific entries cluster at the high-risk end (THER cluster T123–T136; CONTACT-PROACTIVE T097–T101) where the literature concentrates. The moderate-risk uptake gap shaped a distinct group of default-on and risk-triggered entries: T010 opt-out registration prompt (Empirically tested), T011 algorithmically-suggested deposit limit (Theoretically derived), and the extrapolated T202 risk-adaptive dynamic default limits and T204 risk-score-linked ceilings. These translate the prevention-paradox finding into default-on or risk-triggered architectures rather than relying on voluntary uptake. The autonomy-supportive vs action-oriented framing distinction sits in tool delivery specifications rather than as separate entries.</w:t>
       </w:r>
     </w:p>
     <w:p>

</xml_diff>